<commit_message>
Update instructions: add VSCode requirement, fix startup steps
</commit_message>
<xml_diff>
--- a/Инструкция.docx
+++ b/Инструкция.docx
@@ -61,6 +61,17 @@
           <w:sz w:val="22"/>
         </w:rPr>
         <w:t>AutoHotkey v2</w:t>
+      </w:r>
+    </w:p>
+    <w:p>
+      <w:pPr>
+        <w:pStyle w:val="ListBullet"/>
+      </w:pPr>
+      <w:r>
+        <w:rPr>
+          <w:sz w:val="22"/>
+        </w:rPr>
+        <w:t>Visual Studio Code (VSCode)</w:t>
       </w:r>
     </w:p>
     <w:p>
@@ -196,7 +207,7 @@
         <w:rPr>
           <w:sz w:val="22"/>
         </w:rPr>
-        <w:t>1.  Дважды кликни ярлык  VoiceClaude  на рабочем столе</w:t>
+        <w:t>1.  Открой Visual Studio Code</w:t>
       </w:r>
     </w:p>
     <w:p>
@@ -204,7 +215,7 @@
         <w:rPr>
           <w:sz w:val="22"/>
         </w:rPr>
-        <w:t>2.  Подтверди запуск от имени администратора</w:t>
+        <w:t>2.  Открой терминал в VSCode — нажми Ctrl+` (кнопка под Escape)</w:t>
       </w:r>
     </w:p>
     <w:p>
@@ -212,7 +223,7 @@
         <w:rPr>
           <w:sz w:val="22"/>
         </w:rPr>
-        <w:t>3.  Дождись появления окна приложения — оно появится автоматически</w:t>
+        <w:t>3.  Запусти Claude Code в терминале</w:t>
       </w:r>
     </w:p>
     <w:p>
@@ -220,7 +231,39 @@
         <w:rPr>
           <w:sz w:val="22"/>
         </w:rPr>
-        <w:t>4.  При первом запуске подожди пока скачается модель распознавания (нужен интернет)</w:t>
+        <w:t>4.  Дважды кликни ярлык  VoiceClaude  на рабочем столе</w:t>
+      </w:r>
+    </w:p>
+    <w:p>
+      <w:r>
+        <w:rPr>
+          <w:sz w:val="22"/>
+        </w:rPr>
+        <w:t>5.  Подтверди запуск от имени администратора</w:t>
+      </w:r>
+    </w:p>
+    <w:p>
+      <w:r>
+        <w:rPr>
+          <w:sz w:val="22"/>
+        </w:rPr>
+        <w:t>6.  Дождись появления окна приложения с анимацией загрузки</w:t>
+      </w:r>
+    </w:p>
+    <w:p>
+      <w:r>
+        <w:rPr>
+          <w:sz w:val="22"/>
+        </w:rPr>
+        <w:t>7.  При первом запуске подожди пока скачается модель (нужен интернет)</w:t>
+      </w:r>
+    </w:p>
+    <w:p>
+      <w:r>
+        <w:rPr>
+          <w:sz w:val="22"/>
+        </w:rPr>
+        <w:t>8.  Когда анимация станет синей — приложение готово к работе</w:t>
       </w:r>
     </w:p>
     <w:p/>
@@ -239,7 +282,7 @@
           <w:b/>
           <w:sz w:val="22"/>
         </w:rPr>
-        <w:t>Окно VoiceClaude должно быть открыто (работает в фоне).</w:t>
+        <w:t>⚠️  VSCode должен быть открыт — приложение вставляет текст именно в его терминал.</w:t>
       </w:r>
     </w:p>
     <w:p/>
@@ -248,7 +291,7 @@
         <w:rPr>
           <w:sz w:val="22"/>
         </w:rPr>
-        <w:t>1.  Открой VSCode и запусти Claude Code в терминале</w:t>
+        <w:t>1.  Убедись что VSCode открыт и терминал с Claude Code активен</w:t>
       </w:r>
     </w:p>
     <w:p>
@@ -372,7 +415,29 @@
           </w:tcPr>
           <w:p>
             <w:r>
-              <w:t>Зажми Caps Lock чтобы говорить...</w:t>
+              <w:t>Загрузка модели... (оранжевая анимация)</w:t>
+            </w:r>
+          </w:p>
+        </w:tc>
+        <w:tc>
+          <w:tcPr>
+            <w:tcW w:type="dxa" w:w="4320"/>
+          </w:tcPr>
+          <w:p>
+            <w:r>
+              <w:t>Приложение запускается, ждите</w:t>
+            </w:r>
+          </w:p>
+        </w:tc>
+      </w:tr>
+      <w:tr>
+        <w:tc>
+          <w:tcPr>
+            <w:tcW w:type="dxa" w:w="4320"/>
+          </w:tcPr>
+          <w:p>
+            <w:r>
+              <w:t>Зажми Caps Lock чтобы говорить... (синяя анимация)</w:t>
             </w:r>
           </w:p>
         </w:tc>
@@ -394,7 +459,7 @@
           </w:tcPr>
           <w:p>
             <w:r>
-              <w:t>Запись... (отпусти Caps Lock)  + анимация</w:t>
+              <w:t>Запись... (отпусти Caps Lock)</w:t>
             </w:r>
           </w:p>
         </w:tc>
@@ -743,7 +808,29 @@
           </w:tcPr>
           <w:p>
             <w:r>
-              <w:t>Убедись что VSCode открыт, кликни в терминал VSCode</w:t>
+              <w:t>Убедись что VSCode открыт с активным терминалом</w:t>
+            </w:r>
+          </w:p>
+        </w:tc>
+      </w:tr>
+      <w:tr>
+        <w:tc>
+          <w:tcPr>
+            <w:tcW w:type="dxa" w:w="4320"/>
+          </w:tcPr>
+          <w:p>
+            <w:r>
+              <w:t>Python не найден</w:t>
+            </w:r>
+          </w:p>
+        </w:tc>
+        <w:tc>
+          <w:tcPr>
+            <w:tcW w:type="dxa" w:w="4320"/>
+          </w:tcPr>
+          <w:p>
+            <w:r>
+              <w:t>Запусти install.bat от имени администратора, затем перезагрузи ПК</w:t>
             </w:r>
           </w:p>
         </w:tc>
@@ -981,7 +1068,7 @@
           <w:b w:val="0"/>
           <w:sz w:val="18"/>
         </w:rPr>
-        <w:t>Версия 1.0  |  Разработано с помощью Claude Code  |  2026</w:t>
+        <w:t>Версия 1.1  |  Разработано с помощью Claude Code  |  2026</w:t>
       </w:r>
     </w:p>
     <w:sectPr>

</xml_diff>